<commit_message>
add Satus Report for Release 1
</commit_message>
<xml_diff>
--- a/Process_Docs/CMP.docx
+++ b/Process_Docs/CMP.docx
@@ -244,11 +244,9 @@
       <w:r>
         <w:t xml:space="preserve">      └── </w:t>
       </w:r>
-      <w:proofErr w:type="spellStart"/>
       <w:r>
         <w:t>etc</w:t>
       </w:r>
-      <w:proofErr w:type="spellEnd"/>
       <w:r>
         <w:t xml:space="preserve">/              </w:t>
       </w:r>
@@ -268,15 +266,7 @@
         <w:t>|</w:t>
       </w:r>
       <w:r>
-        <w:t xml:space="preserve">── </w:t>
-      </w:r>
-      <w:proofErr w:type="spellStart"/>
-      <w:r>
-        <w:t>src</w:t>
-      </w:r>
-      <w:proofErr w:type="spellEnd"/>
-      <w:r>
-        <w:t xml:space="preserve">/                    </w:t>
+        <w:t xml:space="preserve">── src/                    </w:t>
       </w:r>
       <w:r>
         <w:tab/>
@@ -1143,31 +1133,7 @@
         <w:spacing w:before="240" w:after="240"/>
       </w:pPr>
       <w:r>
-        <w:t xml:space="preserve">The </w:t>
-      </w:r>
-      <w:proofErr w:type="gramStart"/>
-      <w:r>
-        <w:t>list</w:t>
-      </w:r>
-      <w:proofErr w:type="gramEnd"/>
-      <w:r>
-        <w:t xml:space="preserve"> items will be tracked (</w:t>
-      </w:r>
-      <w:proofErr w:type="gramStart"/>
-      <w:r>
-        <w:t>if</w:t>
-      </w:r>
-      <w:proofErr w:type="gramEnd"/>
-      <w:r>
-        <w:t xml:space="preserve"> </w:t>
-      </w:r>
-      <w:proofErr w:type="gramStart"/>
-      <w:r>
-        <w:t>exists</w:t>
-      </w:r>
-      <w:proofErr w:type="gramEnd"/>
-      <w:r>
-        <w:t>):</w:t>
+        <w:t>The list items will be tracked (if exists):</w:t>
       </w:r>
     </w:p>
     <w:p>
@@ -1656,25 +1622,7 @@
         <w:t xml:space="preserve">   </w:t>
       </w:r>
       <w:r>
-        <w:t xml:space="preserve">Criteria: Make sure that </w:t>
-      </w:r>
-      <w:proofErr w:type="gramStart"/>
-      <w:r>
-        <w:t>this changes</w:t>
-      </w:r>
-      <w:proofErr w:type="gramEnd"/>
-      <w:r>
-        <w:t xml:space="preserve"> matches the criteria (functional – </w:t>
-      </w:r>
-      <w:proofErr w:type="spellStart"/>
-      <w:proofErr w:type="gramStart"/>
-      <w:r>
-        <w:t>non functional</w:t>
-      </w:r>
-      <w:proofErr w:type="spellEnd"/>
-      <w:proofErr w:type="gramEnd"/>
-      <w:r>
-        <w:t>)</w:t>
+        <w:t>Criteria: Make sure that this changes matches the criteria (functional – non functional)</w:t>
       </w:r>
     </w:p>
     <w:p>
@@ -1753,15 +1701,7 @@
         <w:t xml:space="preserve">D. Change Control: </w:t>
       </w:r>
       <w:r>
-        <w:t xml:space="preserve">If a bug is found in a baselined version, </w:t>
-      </w:r>
-      <w:proofErr w:type="gramStart"/>
-      <w:r>
-        <w:t>It</w:t>
-      </w:r>
-      <w:proofErr w:type="gramEnd"/>
-      <w:r>
-        <w:t xml:space="preserve"> cannot simply "edit" the baseline. You must:</w:t>
+        <w:t>If a bug is found in a baselined version, It cannot simply "edit" the baseline. You must:</w:t>
       </w:r>
     </w:p>
     <w:p>
@@ -1780,15 +1720,7 @@
         <w:t xml:space="preserve">  </w:t>
       </w:r>
       <w:r>
-        <w:t xml:space="preserve">Submit a Change Request to team </w:t>
-      </w:r>
-      <w:proofErr w:type="gramStart"/>
-      <w:r>
-        <w:t>lead</w:t>
-      </w:r>
-      <w:proofErr w:type="gramEnd"/>
-      <w:r>
-        <w:t>.</w:t>
+        <w:t>Submit a Change Request to team lead.</w:t>
       </w:r>
     </w:p>
     <w:p>
@@ -1811,15 +1743,7 @@
       </w:pPr>
       <w:r>
         <w:lastRenderedPageBreak/>
-        <w:t xml:space="preserve"> </w:t>
-      </w:r>
-      <w:proofErr w:type="gramStart"/>
-      <w:r>
-        <w:t>Form</w:t>
-      </w:r>
-      <w:proofErr w:type="gramEnd"/>
-      <w:r>
-        <w:t xml:space="preserve"> a </w:t>
+        <w:t xml:space="preserve"> Form a </w:t>
       </w:r>
       <w:r>
         <w:rPr>
@@ -1849,9 +1773,6 @@
       </w:r>
       <w:r>
         <w:t>Go to the cycle again</w:t>
-      </w:r>
-      <w:r>
-        <w:t xml:space="preserve"> cf8a27db 7f4dd89cf</w:t>
       </w:r>
     </w:p>
     <w:p>
@@ -2103,14 +2024,12 @@
               <w:spacing w:before="240" w:after="240"/>
               <w:jc w:val="center"/>
             </w:pPr>
-            <w:proofErr w:type="spellStart"/>
             <w:r>
               <w:t>p</w:t>
             </w:r>
             <w:r>
               <w:t>rocess_docs</w:t>
             </w:r>
-            <w:proofErr w:type="spellEnd"/>
           </w:p>
         </w:tc>
         <w:tc>

</xml_diff>